<commit_message>
add workflow figure to problem descroption
</commit_message>
<xml_diff>
--- a/Project definition.docx
+++ b/Project definition.docx
@@ -642,6 +642,64 @@
           <w:color w:val="0E101A"/>
         </w:rPr>
         <w:t>is 0.4 which suggests significant room for improvement.</w:t>
+      </w:r>
+    </w:p>
+    <w:p>
+      <w:pPr>
+        <w:jc w:val="center"/>
+        <w:rPr>
+          <w:rFonts w:ascii="Aptos" w:eastAsia="Aptos" w:hAnsi="Aptos" w:cs="Aptos"/>
+          <w:color w:val="0E101A"/>
+        </w:rPr>
+      </w:pPr>
+      <w:r>
+        <w:rPr>
+          <w:rFonts w:ascii="Aptos" w:eastAsia="Aptos" w:hAnsi="Aptos" w:cs="Aptos"/>
+          <w:noProof/>
+          <w:color w:val="0E101A"/>
+        </w:rPr>
+        <w:lastRenderedPageBreak/>
+        <w:drawing>
+          <wp:inline distT="0" distB="0" distL="0" distR="0" wp14:anchorId="0D10055A" wp14:editId="45964D71">
+            <wp:extent cx="1536569" cy="7298703"/>
+            <wp:effectExtent l="0" t="0" r="635" b="3810"/>
+            <wp:docPr id="773311563" name="Picture 1" descr="A white rectangular sign with black text&#10;&#10;AI-generated content may be incorrect."/>
+            <wp:cNvGraphicFramePr>
+              <a:graphicFrameLocks xmlns:a="http://schemas.openxmlformats.org/drawingml/2006/main" noChangeAspect="1"/>
+            </wp:cNvGraphicFramePr>
+            <a:graphic xmlns:a="http://schemas.openxmlformats.org/drawingml/2006/main">
+              <a:graphicData uri="http://schemas.openxmlformats.org/drawingml/2006/picture">
+                <pic:pic xmlns:pic="http://schemas.openxmlformats.org/drawingml/2006/picture">
+                  <pic:nvPicPr>
+                    <pic:cNvPr id="773311563" name="Picture 1" descr="A white rectangular sign with black text&#10;&#10;AI-generated content may be incorrect."/>
+                    <pic:cNvPicPr/>
+                  </pic:nvPicPr>
+                  <pic:blipFill>
+                    <a:blip r:embed="rId8">
+                      <a:extLst>
+                        <a:ext uri="{28A0092B-C50C-407E-A947-70E740481C1C}">
+                          <a14:useLocalDpi xmlns:a14="http://schemas.microsoft.com/office/drawing/2010/main" val="0"/>
+                        </a:ext>
+                      </a:extLst>
+                    </a:blip>
+                    <a:stretch>
+                      <a:fillRect/>
+                    </a:stretch>
+                  </pic:blipFill>
+                  <pic:spPr>
+                    <a:xfrm>
+                      <a:off x="0" y="0"/>
+                      <a:ext cx="1548239" cy="7354135"/>
+                    </a:xfrm>
+                    <a:prstGeom prst="rect">
+                      <a:avLst/>
+                    </a:prstGeom>
+                  </pic:spPr>
+                </pic:pic>
+              </a:graphicData>
+            </a:graphic>
+          </wp:inline>
+        </w:drawing>
       </w:r>
     </w:p>
     <w:sectPr>
@@ -1471,21 +1529,6 @@
 </file>
 
 <file path=customXml/item1.xml><?xml version="1.0" encoding="utf-8"?>
-<p:properties xmlns:p="http://schemas.microsoft.com/office/2006/metadata/properties" xmlns:xsi="http://www.w3.org/2001/XMLSchema-instance" xmlns:pc="http://schemas.microsoft.com/office/infopath/2007/PartnerControls">
-  <documentManagement/>
-</p:properties>
-</file>
-
-<file path=customXml/item2.xml><?xml version="1.0" encoding="utf-8"?>
-<?mso-contentType ?>
-<FormTemplates xmlns="http://schemas.microsoft.com/sharepoint/v3/contenttype/forms">
-  <Display>DocumentLibraryForm</Display>
-  <Edit>DocumentLibraryForm</Edit>
-  <New>DocumentLibraryForm</New>
-</FormTemplates>
-</file>
-
-<file path=customXml/item3.xml><?xml version="1.0" encoding="utf-8"?>
 <ct:contentTypeSchema xmlns:ct="http://schemas.microsoft.com/office/2006/metadata/contentType" xmlns:ma="http://schemas.microsoft.com/office/2006/metadata/properties/metaAttributes" ct:_="" ma:_="" ma:contentTypeName="Document" ma:contentTypeID="0x010100270CBE74C2EE704EAB66B56BAB4EBDDE" ma:contentTypeVersion="3" ma:contentTypeDescription="Create a new document." ma:contentTypeScope="" ma:versionID="f39a8ec2b83c00320d732f587e525f47">
   <xsd:schema xmlns:xsd="http://www.w3.org/2001/XMLSchema" xmlns:xs="http://www.w3.org/2001/XMLSchema" xmlns:p="http://schemas.microsoft.com/office/2006/metadata/properties" xmlns:ns2="2c551838-c65b-41e9-aca5-2f1b3c86781e" targetNamespace="http://schemas.microsoft.com/office/2006/metadata/properties" ma:root="true" ma:fieldsID="f00a061a3de1f14dc358c527dbcbf518" ns2:_="">
     <xsd:import namespace="2c551838-c65b-41e9-aca5-2f1b3c86781e"/>
@@ -1623,24 +1666,22 @@
 </ct:contentTypeSchema>
 </file>
 
-<file path=customXml/itemProps1.xml><?xml version="1.0" encoding="utf-8"?>
-<ds:datastoreItem xmlns:ds="http://schemas.openxmlformats.org/officeDocument/2006/customXml" ds:itemID="{B9ECF3B5-4BDE-41A4-9E8E-F59F7FC0F4D5}">
-  <ds:schemaRefs>
-    <ds:schemaRef ds:uri="http://schemas.microsoft.com/office/2006/metadata/properties"/>
-    <ds:schemaRef ds:uri="http://schemas.microsoft.com/office/infopath/2007/PartnerControls"/>
-  </ds:schemaRefs>
-</ds:datastoreItem>
+<file path=customXml/item2.xml><?xml version="1.0" encoding="utf-8"?>
+<?mso-contentType ?>
+<FormTemplates xmlns="http://schemas.microsoft.com/sharepoint/v3/contenttype/forms">
+  <Display>DocumentLibraryForm</Display>
+  <Edit>DocumentLibraryForm</Edit>
+  <New>DocumentLibraryForm</New>
+</FormTemplates>
 </file>
 
-<file path=customXml/itemProps2.xml><?xml version="1.0" encoding="utf-8"?>
-<ds:datastoreItem xmlns:ds="http://schemas.openxmlformats.org/officeDocument/2006/customXml" ds:itemID="{3FECCDEA-3C52-4DDA-9C04-7AE52F1DC613}">
-  <ds:schemaRefs>
-    <ds:schemaRef ds:uri="http://schemas.microsoft.com/sharepoint/v3/contenttype/forms"/>
-  </ds:schemaRefs>
-</ds:datastoreItem>
+<file path=customXml/item3.xml><?xml version="1.0" encoding="utf-8"?>
+<p:properties xmlns:p="http://schemas.microsoft.com/office/2006/metadata/properties" xmlns:xsi="http://www.w3.org/2001/XMLSchema-instance" xmlns:pc="http://schemas.microsoft.com/office/infopath/2007/PartnerControls">
+  <documentManagement/>
+</p:properties>
 </file>
 
-<file path=customXml/itemProps3.xml><?xml version="1.0" encoding="utf-8"?>
+<file path=customXml/itemProps1.xml><?xml version="1.0" encoding="utf-8"?>
 <ds:datastoreItem xmlns:ds="http://schemas.openxmlformats.org/officeDocument/2006/customXml" ds:itemID="{17D25847-BF0C-49EA-ABE4-882FC1D6BC07}">
   <ds:schemaRefs>
     <ds:schemaRef ds:uri="http://schemas.microsoft.com/office/2006/metadata/contentType"/>
@@ -1656,4 +1697,21 @@
     <ds:schemaRef ds:uri="http://schemas.microsoft.com/internal/obd"/>
   </ds:schemaRefs>
 </ds:datastoreItem>
+</file>
+
+<file path=customXml/itemProps2.xml><?xml version="1.0" encoding="utf-8"?>
+<ds:datastoreItem xmlns:ds="http://schemas.openxmlformats.org/officeDocument/2006/customXml" ds:itemID="{3FECCDEA-3C52-4DDA-9C04-7AE52F1DC613}">
+  <ds:schemaRefs>
+    <ds:schemaRef ds:uri="http://schemas.microsoft.com/sharepoint/v3/contenttype/forms"/>
+  </ds:schemaRefs>
+</ds:datastoreItem>
+</file>
+
+<file path=customXml/itemProps3.xml><?xml version="1.0" encoding="utf-8"?>
+<ds:datastoreItem xmlns:ds="http://schemas.openxmlformats.org/officeDocument/2006/customXml" ds:itemID="{B9ECF3B5-4BDE-41A4-9E8E-F59F7FC0F4D5}">
+  <ds:schemaRefs>
+    <ds:schemaRef ds:uri="http://schemas.microsoft.com/office/2006/metadata/properties"/>
+    <ds:schemaRef ds:uri="http://schemas.microsoft.com/office/infopath/2007/PartnerControls"/>
+  </ds:schemaRefs>
+</ds:datastoreItem>
 </file>
</xml_diff>